<commit_message>
feat(ui): enhance batch repair error handling and donut chart layout
Refactor the batch repair process to explicitly track and report repair
failures, such as invalid GTIN check digits, instead of silently
skipping them. This includes adding error state to inspection rows and
updating the summary messaging.

Additionally, updates the donut chart CSS to improve centering and
adjusts the dimensions for better visual balance.
</commit_message>
<xml_diff>
--- a/sample/Raspberry cheesecake  Label (6''x4'').docx
+++ b/sample/Raspberry cheesecake  Label (6''x4'').docx
@@ -1623,39 +1623,7 @@
                                 <w:sz w:val="16"/>
                                 <w:szCs w:val="16"/>
                               </w:rPr>
-                              <w:t>(01)10627146285572(15)</w:t>
-                            </w:r>
-                            <w:r>
-                              <w:rPr>
-                                <w:rFonts w:ascii="Arial" w:hAnsi="Arial" w:cs="Arial"/>
-                                <w:sz w:val="16"/>
-                                <w:szCs w:val="16"/>
-                              </w:rPr>
-                              <w:t>3011</w:t>
-                            </w:r>
-                            <w:r>
-                              <w:rPr>
-                                <w:rFonts w:ascii="Arial" w:hAnsi="Arial" w:cs="Arial"/>
-                                <w:sz w:val="16"/>
-                                <w:szCs w:val="16"/>
-                              </w:rPr>
-                              <w:t>23(10)</w:t>
-                            </w:r>
-                            <w:r>
-                              <w:rPr>
-                                <w:rFonts w:ascii="Arial" w:hAnsi="Arial" w:cs="Arial"/>
-                                <w:sz w:val="16"/>
-                                <w:szCs w:val="16"/>
-                              </w:rPr>
-                              <w:t>111</w:t>
-                            </w:r>
-                            <w:r>
-                              <w:rPr>
-                                <w:rFonts w:ascii="Arial" w:hAnsi="Arial" w:cs="Arial"/>
-                                <w:sz w:val="16"/>
-                                <w:szCs w:val="16"/>
-                              </w:rPr>
-                              <w:t>22</w:t>
+                              <w:t>(01)10627146285572(15)250923(10)72722</w:t>
                             </w:r>
                           </w:p>
                           <w:p>
@@ -1767,11 +1735,7 @@
           </mc:Choice>
           <mc:Fallback>
             <w:pict>
-              <v:shapetype w14:anchorId="07DCC27C" id="_x0000_t202" coordsize="21600,21600" o:spt="202" path="m,l,21600r21600,l21600,xe">
-                <v:stroke joinstyle="miter"/>
-                <v:path gradientshapeok="t" o:connecttype="rect"/>
-              </v:shapetype>
-              <v:shape id="Text Box 7" o:spid="_x0000_s1031" type="#_x0000_t202" alt="(01)10759242722054(15)250923(10)72722" style="position:absolute;left:0;text-align:left;margin-left:37.6pt;margin-top:44.1pt;width:215.4pt;height:53.9pt;z-index:251666432;visibility:visible;mso-wrap-style:square;mso-height-percent:0;mso-wrap-distance-left:9pt;mso-wrap-distance-top:0;mso-wrap-distance-right:9pt;mso-wrap-distance-bottom:0;mso-position-horizontal:absolute;mso-position-horizontal-relative:page;mso-position-vertical:absolute;mso-position-vertical-relative:text;mso-height-percent:0;mso-height-relative:margin;v-text-anchor:top" o:gfxdata="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" fillcolor="white [3201]" stroked="f" strokeweight=".5pt">
+              <v:shape w14:anchorId="07DCC27C" id="Text Box 7" o:spid="_x0000_s1031" type="#_x0000_t202" alt="(01)10759242722054(15)250923(10)72722" style="position:absolute;left:0;text-align:left;margin-left:37.6pt;margin-top:44.1pt;width:215.4pt;height:53.9pt;z-index:251666432;visibility:visible;mso-wrap-style:square;mso-height-percent:0;mso-wrap-distance-left:9pt;mso-wrap-distance-top:0;mso-wrap-distance-right:9pt;mso-wrap-distance-bottom:0;mso-position-horizontal:absolute;mso-position-horizontal-relative:page;mso-position-vertical:absolute;mso-position-vertical-relative:text;mso-height-percent:0;mso-height-relative:margin;v-text-anchor:top" o:gfxdata="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" fillcolor="white [3201]" stroked="f" strokeweight=".5pt">
                 <v:textbox>
                   <w:txbxContent>
                     <w:p>
@@ -1790,39 +1754,7 @@
                           <w:sz w:val="16"/>
                           <w:szCs w:val="16"/>
                         </w:rPr>
-                        <w:t>(01)10627146285572(15)</w:t>
-                      </w:r>
-                      <w:r>
-                        <w:rPr>
-                          <w:rFonts w:ascii="Arial" w:hAnsi="Arial" w:cs="Arial"/>
-                          <w:sz w:val="16"/>
-                          <w:szCs w:val="16"/>
-                        </w:rPr>
-                        <w:t>3011</w:t>
-                      </w:r>
-                      <w:r>
-                        <w:rPr>
-                          <w:rFonts w:ascii="Arial" w:hAnsi="Arial" w:cs="Arial"/>
-                          <w:sz w:val="16"/>
-                          <w:szCs w:val="16"/>
-                        </w:rPr>
-                        <w:t>23(10)</w:t>
-                      </w:r>
-                      <w:r>
-                        <w:rPr>
-                          <w:rFonts w:ascii="Arial" w:hAnsi="Arial" w:cs="Arial"/>
-                          <w:sz w:val="16"/>
-                          <w:szCs w:val="16"/>
-                        </w:rPr>
-                        <w:t>111</w:t>
-                      </w:r>
-                      <w:r>
-                        <w:rPr>
-                          <w:rFonts w:ascii="Arial" w:hAnsi="Arial" w:cs="Arial"/>
-                          <w:sz w:val="16"/>
-                          <w:szCs w:val="16"/>
-                        </w:rPr>
-                        <w:t>22</w:t>
+                        <w:t>(01)10627146285572(15)250923(10)72722</w:t>
                       </w:r>
                     </w:p>
                     <w:p>

</xml_diff>